<commit_message>
Remediate data leakage across ML pipeline and regenerate reports
</commit_message>
<xml_diff>
--- a/project_report.docx
+++ b/project_report.docx
@@ -494,7 +494,7 @@
           <w:color w:val="1B365D"/>
           <w:sz w:val="56"/>
         </w:rPr>
-        <w:t>99.9653%</w:t>
+        <w:t>99.8544%</w:t>
         <w:br/>
         <w:br/>
       </w:r>
@@ -512,7 +512,7 @@
           <w:color w:val="4B6B94"/>
           <w:sz w:val="44"/>
         </w:rPr>
-        <w:t>0.999653</w:t>
+        <w:t>0.998545</w:t>
         <w:br/>
       </w:r>
     </w:p>
@@ -749,6 +749,29 @@
               <w:rPr>
                 <w:sz w:val="19"/>
               </w:rPr>
+              <w:t>0.9919</w:t>
+            </w:r>
+          </w:p>
+        </w:tc>
+        <w:tc>
+          <w:tcPr>
+            <w:tcW w:type="dxa" w:w="1296"/>
+            <w:tcMar>
+              <w:top w:w="90" w:type="dxa"/>
+              <w:bottom w:w="90" w:type="dxa"/>
+              <w:left w:w="150" w:type="dxa"/>
+              <w:right w:w="150" w:type="dxa"/>
+            </w:tcMar>
+          </w:tcPr>
+          <w:p>
+            <w:pPr>
+              <w:spacing w:after="0"/>
+              <w:jc w:val="center"/>
+            </w:pPr>
+            <w:r>
+              <w:rPr>
+                <w:sz w:val="19"/>
+              </w:rPr>
               <w:t>1.0000</w:t>
             </w:r>
           </w:p>
@@ -772,7 +795,7 @@
               <w:rPr>
                 <w:sz w:val="19"/>
               </w:rPr>
-              <w:t>0.9988</w:t>
+              <w:t>0.9959</w:t>
             </w:r>
           </w:p>
         </w:tc>
@@ -795,30 +818,7 @@
               <w:rPr>
                 <w:sz w:val="19"/>
               </w:rPr>
-              <w:t>0.9994</w:t>
-            </w:r>
-          </w:p>
-        </w:tc>
-        <w:tc>
-          <w:tcPr>
-            <w:tcW w:type="dxa" w:w="1296"/>
-            <w:tcMar>
-              <w:top w:w="90" w:type="dxa"/>
-              <w:bottom w:w="90" w:type="dxa"/>
-              <w:left w:w="150" w:type="dxa"/>
-              <w:right w:w="150" w:type="dxa"/>
-            </w:tcMar>
-          </w:tcPr>
-          <w:p>
-            <w:pPr>
-              <w:spacing w:after="0"/>
-              <w:jc w:val="center"/>
-            </w:pPr>
-            <w:r>
-              <w:rPr>
-                <w:sz w:val="19"/>
-              </w:rPr>
-              <w:t>2400</w:t>
+              <w:t>245</w:t>
             </w:r>
           </w:p>
         </w:tc>
@@ -961,7 +961,7 @@
               <w:rPr>
                 <w:sz w:val="19"/>
               </w:rPr>
-              <w:t>2400</w:t>
+              <w:t>159</w:t>
             </w:r>
           </w:p>
         </w:tc>
@@ -1035,7 +1035,7 @@
               <w:rPr>
                 <w:sz w:val="19"/>
               </w:rPr>
-              <w:t>0.9996</w:t>
+              <w:t>0.9975</w:t>
             </w:r>
           </w:p>
         </w:tc>
@@ -1058,7 +1058,7 @@
               <w:rPr>
                 <w:sz w:val="19"/>
               </w:rPr>
-              <w:t>0.9996</w:t>
+              <w:t>0.9975</w:t>
             </w:r>
           </w:p>
         </w:tc>
@@ -1081,7 +1081,7 @@
               <w:rPr>
                 <w:sz w:val="19"/>
               </w:rPr>
-              <w:t>0.9996</w:t>
+              <w:t>0.9975</w:t>
             </w:r>
           </w:p>
         </w:tc>
@@ -1104,7 +1104,7 @@
               <w:rPr>
                 <w:sz w:val="19"/>
               </w:rPr>
-              <w:t>2400</w:t>
+              <w:t>394</w:t>
             </w:r>
           </w:p>
         </w:tc>
@@ -1201,7 +1201,7 @@
               <w:rPr>
                 <w:sz w:val="19"/>
               </w:rPr>
-              <w:t>1.0000</w:t>
+              <w:t>0.9982</w:t>
             </w:r>
           </w:p>
         </w:tc>
@@ -1224,7 +1224,7 @@
               <w:rPr>
                 <w:sz w:val="19"/>
               </w:rPr>
-              <w:t>1.0000</w:t>
+              <w:t>0.9991</w:t>
             </w:r>
           </w:p>
         </w:tc>
@@ -1247,7 +1247,7 @@
               <w:rPr>
                 <w:sz w:val="19"/>
               </w:rPr>
-              <w:t>2400</w:t>
+              <w:t>546</w:t>
             </w:r>
           </w:p>
         </w:tc>
@@ -1321,7 +1321,7 @@
               <w:rPr>
                 <w:sz w:val="19"/>
               </w:rPr>
-              <w:t>0.9992</w:t>
+              <w:t>1.0000</w:t>
             </w:r>
           </w:p>
         </w:tc>
@@ -1344,7 +1344,7 @@
               <w:rPr>
                 <w:sz w:val="19"/>
               </w:rPr>
-              <w:t>0.9996</w:t>
+              <w:t>1.0000</w:t>
             </w:r>
           </w:p>
         </w:tc>
@@ -1367,7 +1367,7 @@
               <w:rPr>
                 <w:sz w:val="19"/>
               </w:rPr>
-              <w:t>0.9994</w:t>
+              <w:t>1.0000</w:t>
             </w:r>
           </w:p>
         </w:tc>
@@ -1390,7 +1390,7 @@
               <w:rPr>
                 <w:sz w:val="19"/>
               </w:rPr>
-              <w:t>2400</w:t>
+              <w:t>640</w:t>
             </w:r>
           </w:p>
         </w:tc>
@@ -1464,29 +1464,6 @@
               <w:rPr>
                 <w:sz w:val="19"/>
               </w:rPr>
-              <w:t>0.9992</w:t>
-            </w:r>
-          </w:p>
-        </w:tc>
-        <w:tc>
-          <w:tcPr>
-            <w:tcW w:type="dxa" w:w="1296"/>
-            <w:tcMar>
-              <w:top w:w="90" w:type="dxa"/>
-              <w:bottom w:w="90" w:type="dxa"/>
-              <w:left w:w="150" w:type="dxa"/>
-              <w:right w:w="150" w:type="dxa"/>
-            </w:tcMar>
-          </w:tcPr>
-          <w:p>
-            <w:pPr>
-              <w:spacing w:after="0"/>
-              <w:jc w:val="center"/>
-            </w:pPr>
-            <w:r>
-              <w:rPr>
-                <w:sz w:val="19"/>
-              </w:rPr>
               <w:t>1.0000</w:t>
             </w:r>
           </w:p>
@@ -1510,7 +1487,7 @@
               <w:rPr>
                 <w:sz w:val="19"/>
               </w:rPr>
-              <w:t>0.9996</w:t>
+              <w:t>0.9870</w:t>
             </w:r>
           </w:p>
         </w:tc>
@@ -1533,7 +1510,30 @@
               <w:rPr>
                 <w:sz w:val="19"/>
               </w:rPr>
-              <w:t>2400</w:t>
+              <w:t>0.9935</w:t>
+            </w:r>
+          </w:p>
+        </w:tc>
+        <w:tc>
+          <w:tcPr>
+            <w:tcW w:type="dxa" w:w="1296"/>
+            <w:tcMar>
+              <w:top w:w="90" w:type="dxa"/>
+              <w:bottom w:w="90" w:type="dxa"/>
+              <w:left w:w="150" w:type="dxa"/>
+              <w:right w:w="150" w:type="dxa"/>
+            </w:tcMar>
+          </w:tcPr>
+          <w:p>
+            <w:pPr>
+              <w:spacing w:after="0"/>
+              <w:jc w:val="center"/>
+            </w:pPr>
+            <w:r>
+              <w:rPr>
+                <w:sz w:val="19"/>
+              </w:rPr>
+              <w:t>77</w:t>
             </w:r>
           </w:p>
         </w:tc>
@@ -1826,7 +1826,7 @@
                 <w:color w:val="1B365D"/>
                 <w:sz w:val="18"/>
               </w:rPr>
-              <w:t>2397</w:t>
+              <w:t>245</w:t>
             </w:r>
           </w:p>
         </w:tc>
@@ -1908,7 +1908,6 @@
               <w:left w:w="150" w:type="dxa"/>
               <w:right w:w="150" w:type="dxa"/>
             </w:tcMar>
-            <w:shd w:fill="FFEBEE"/>
           </w:tcPr>
           <w:p>
             <w:pPr>
@@ -1917,11 +1916,9 @@
             </w:pPr>
             <w:r>
               <w:rPr>
-                <w:b/>
-                <w:color w:val="C62828"/>
                 <w:sz w:val="18"/>
               </w:rPr>
-              <w:t>1</w:t>
+              <w:t>0</w:t>
             </w:r>
           </w:p>
         </w:tc>
@@ -1934,7 +1931,6 @@
               <w:left w:w="150" w:type="dxa"/>
               <w:right w:w="150" w:type="dxa"/>
             </w:tcMar>
-            <w:shd w:fill="FFEBEE"/>
           </w:tcPr>
           <w:p>
             <w:pPr>
@@ -1943,11 +1939,9 @@
             </w:pPr>
             <w:r>
               <w:rPr>
-                <w:b/>
-                <w:color w:val="C62828"/>
                 <w:sz w:val="18"/>
               </w:rPr>
-              <w:t>2</w:t>
+              <w:t>0</w:t>
             </w:r>
           </w:p>
         </w:tc>
@@ -2021,7 +2015,7 @@
                 <w:color w:val="1B365D"/>
                 <w:sz w:val="18"/>
               </w:rPr>
-              <w:t>2400</w:t>
+              <w:t>159</w:t>
             </w:r>
           </w:p>
         </w:tc>
@@ -2151,6 +2145,7 @@
               <w:left w:w="150" w:type="dxa"/>
               <w:right w:w="150" w:type="dxa"/>
             </w:tcMar>
+            <w:shd w:fill="FFEBEE"/>
           </w:tcPr>
           <w:p>
             <w:pPr>
@@ -2159,9 +2154,11 @@
             </w:pPr>
             <w:r>
               <w:rPr>
+                <w:b/>
+                <w:color w:val="C62828"/>
                 <w:sz w:val="18"/>
               </w:rPr>
-              <w:t>0</w:t>
+              <w:t>1</w:t>
             </w:r>
           </w:p>
         </w:tc>
@@ -2210,7 +2207,7 @@
                 <w:color w:val="1B365D"/>
                 <w:sz w:val="18"/>
               </w:rPr>
-              <w:t>2399</w:t>
+              <w:t>393</w:t>
             </w:r>
           </w:p>
         </w:tc>
@@ -2246,7 +2243,6 @@
               <w:left w:w="150" w:type="dxa"/>
               <w:right w:w="150" w:type="dxa"/>
             </w:tcMar>
-            <w:shd w:fill="FFEBEE"/>
           </w:tcPr>
           <w:p>
             <w:pPr>
@@ -2255,11 +2251,9 @@
             </w:pPr>
             <w:r>
               <w:rPr>
-                <w:b/>
-                <w:color w:val="C62828"/>
                 <w:sz w:val="18"/>
               </w:rPr>
-              <w:t>1</w:t>
+              <w:t>0</w:t>
             </w:r>
           </w:p>
         </w:tc>
@@ -2366,6 +2360,7 @@
               <w:left w:w="150" w:type="dxa"/>
               <w:right w:w="150" w:type="dxa"/>
             </w:tcMar>
+            <w:shd w:fill="FFEBEE"/>
           </w:tcPr>
           <w:p>
             <w:pPr>
@@ -2374,9 +2369,11 @@
             </w:pPr>
             <w:r>
               <w:rPr>
+                <w:b/>
+                <w:color w:val="C62828"/>
                 <w:sz w:val="18"/>
               </w:rPr>
-              <w:t>0</w:t>
+              <w:t>1</w:t>
             </w:r>
           </w:p>
         </w:tc>
@@ -2402,7 +2399,7 @@
                 <w:color w:val="1B365D"/>
                 <w:sz w:val="18"/>
               </w:rPr>
-              <w:t>2400</w:t>
+              <w:t>545</w:t>
             </w:r>
           </w:p>
         </w:tc>
@@ -2532,7 +2529,6 @@
               <w:left w:w="150" w:type="dxa"/>
               <w:right w:w="150" w:type="dxa"/>
             </w:tcMar>
-            <w:shd w:fill="FFEBEE"/>
           </w:tcPr>
           <w:p>
             <w:pPr>
@@ -2541,11 +2537,9 @@
             </w:pPr>
             <w:r>
               <w:rPr>
-                <w:b/>
-                <w:color w:val="C62828"/>
                 <w:sz w:val="18"/>
               </w:rPr>
-              <w:t>1</w:t>
+              <w:t>0</w:t>
             </w:r>
           </w:p>
         </w:tc>
@@ -2594,7 +2588,7 @@
                 <w:color w:val="1B365D"/>
                 <w:sz w:val="18"/>
               </w:rPr>
-              <w:t>2399</w:t>
+              <w:t>640</w:t>
             </w:r>
           </w:p>
         </w:tc>
@@ -2655,6 +2649,7 @@
               <w:left w:w="150" w:type="dxa"/>
               <w:right w:w="150" w:type="dxa"/>
             </w:tcMar>
+            <w:shd w:fill="FFEBEE"/>
           </w:tcPr>
           <w:p>
             <w:pPr>
@@ -2663,9 +2658,11 @@
             </w:pPr>
             <w:r>
               <w:rPr>
+                <w:b/>
+                <w:color w:val="C62828"/>
                 <w:sz w:val="18"/>
               </w:rPr>
-              <w:t>0</w:t>
+              <w:t>1</w:t>
             </w:r>
           </w:p>
         </w:tc>
@@ -2783,7 +2780,7 @@
                 <w:color w:val="1B365D"/>
                 <w:sz w:val="18"/>
               </w:rPr>
-              <w:t>2400</w:t>
+              <w:t>76</w:t>
             </w:r>
           </w:p>
         </w:tc>

</xml_diff>

<commit_message>
Enhance generate_report.py to dynamically parse preprocessing/augmentation stats and report table
</commit_message>
<xml_diff>
--- a/project_report.docx
+++ b/project_report.docx
@@ -283,11 +283,21 @@
               <w:rPr>
                 <w:sz w:val="19"/>
               </w:rPr>
-              <w:t>• Total Processed Samples: ~18,000 landmarks vectors</w:t>
+              <w:t>• Total Raw Samples Detected: 10333 landmarks vectors</w:t>
               <w:br/>
-              <w:t>• Train Split: 80% (used to parameterize neural network weights)</w:t>
+              <w:t xml:space="preserve">  - Train Split (Raw): 8272 samples (~80%)</w:t>
               <w:br/>
-              <w:t>• Test Split: 20% (strictly preserved for pristine mathematical evaluation)</w:t>
+              <w:t xml:space="preserve">  - Test Split (Raw): 2061 samples (~20%)</w:t>
+              <w:br/>
+              <w:t>• Balanced Augmented Training Set: 76800 samples (12,800 per class)</w:t>
+              <w:br/>
+              <w:t>• Final Leak-Free Preprocessed Splits:</w:t>
+              <w:br/>
+              <w:t xml:space="preserve">  - Train Split (Augmented): 65280 samples (85%)</w:t>
+              <w:br/>
+              <w:t xml:space="preserve">  - Validation Split (Augmented): 11520 samples (15%)</w:t>
+              <w:br/>
+              <w:t xml:space="preserve">  - Test Split (Pristine Raw): 2061 samples (100% isolated)</w:t>
               <w:br/>
               <w:t>• Gestures Supported: fist, l_gesture, palm, peace, three_fingers, thumbs_up</w:t>
             </w:r>

</xml_diff>

<commit_message>
Add Section 9 detailing end-to-end development & execution workflow to generated reports
</commit_message>
<xml_diff>
--- a/project_report.docx
+++ b/project_report.docx
@@ -2854,6 +2854,144 @@
         <w:t>To run native real-time inference on mobile devices, the trained models are compiled into a Float16 TFLite format and exported alongside fully-parameterized coordinate scaling configurations. This guarantees identical dart-side feature scaling, unlocking low-power local predictions on iOS and Android devices.</w:t>
       </w:r>
     </w:p>
+    <w:p>
+      <w:pPr>
+        <w:keepNext/>
+        <w:spacing w:before="360" w:after="160"/>
+        <w:pBdr>
+          <w:bottom w:val="single" w:sz="6" w:space="4" w:color="1B365D"/>
+        </w:pBdr>
+      </w:pPr>
+      <w:r>
+        <w:rPr>
+          <w:rFonts w:ascii="Calibri Light" w:hAnsi="Calibri Light"/>
+          <w:b/>
+          <w:color w:val="1B365D"/>
+          <w:sz w:val="36"/>
+        </w:rPr>
+        <w:t>9. End-to-End Development &amp; Execution Workflow</w:t>
+      </w:r>
+    </w:p>
+    <w:p>
+      <w:pPr>
+        <w:spacing w:line="276" w:lineRule="auto" w:after="160"/>
+      </w:pPr>
+      <w:r>
+        <w:t>To reproduce the zero-leakage model training, mobile conversion, and live control deployment, the pipeline executes chronologically across the following seven key stages:</w:t>
+      </w:r>
+    </w:p>
+    <w:p>
+      <w:pPr>
+        <w:pStyle w:val="ListBullet"/>
+        <w:spacing w:after="80"/>
+      </w:pPr>
+      <w:r>
+        <w:rPr>
+          <w:b/>
+          <w:color w:val="4B6B94"/>
+        </w:rPr>
+        <w:t xml:space="preserve">Dataset Splits Curation: </w:t>
+      </w:r>
+      <w:r>
+        <w:t>Organize raw camera images into isolated split folders (dataset/train/ and dataset/test/) to safeguard physical class separations.</w:t>
+      </w:r>
+    </w:p>
+    <w:p>
+      <w:pPr>
+        <w:pStyle w:val="ListBullet"/>
+        <w:spacing w:after="80"/>
+      </w:pPr>
+      <w:r>
+        <w:rPr>
+          <w:b/>
+          <w:color w:val="4B6B94"/>
+        </w:rPr>
+        <w:t xml:space="preserve">Raw Landmark Extraction (process_dataset.py): </w:t>
+      </w:r>
+      <w:r>
+        <w:t>Extracts coordinate vectors using MediaPipe, generating independent train_raw.csv and test_raw.csv files with zero initial leakage.</w:t>
+      </w:r>
+    </w:p>
+    <w:p>
+      <w:pPr>
+        <w:pStyle w:val="ListBullet"/>
+        <w:spacing w:after="80"/>
+      </w:pPr>
+      <w:r>
+        <w:rPr>
+          <w:b/>
+          <w:color w:val="4B6B94"/>
+        </w:rPr>
+        <w:t xml:space="preserve">Isolated Training Augmentation (augment_data.py): </w:t>
+      </w:r>
+      <w:r>
+        <w:t>Performs mirror-flipping, scaling, and noise additions strictly on the training CSV to balance classes, keeping testing landmarks pristine.</w:t>
+      </w:r>
+    </w:p>
+    <w:p>
+      <w:pPr>
+        <w:pStyle w:val="ListBullet"/>
+        <w:spacing w:after="80"/>
+      </w:pPr>
+      <w:r>
+        <w:rPr>
+          <w:b/>
+          <w:color w:val="4B6B94"/>
+        </w:rPr>
+        <w:t xml:space="preserve">Leak-Free Normalisation &amp; Splitting (preprocess.py): </w:t>
+      </w:r>
+      <w:r>
+        <w:t>Fits standard scaler strictly on the augmented training split, applies geometric transformations, splits validation (15%), and exports preprocessed numpy splits.</w:t>
+      </w:r>
+    </w:p>
+    <w:p>
+      <w:pPr>
+        <w:pStyle w:val="ListBullet"/>
+        <w:spacing w:after="80"/>
+      </w:pPr>
+      <w:r>
+        <w:rPr>
+          <w:b/>
+          <w:color w:val="4B6B94"/>
+        </w:rPr>
+        <w:t xml:space="preserve">MLP Model Training &amp; Evaluation (train.py): </w:t>
+      </w:r>
+      <w:r>
+        <w:t>Trains the feed-forward MLP with early stopping on validation loss, evaluating the final model on pristine test set arrays.</w:t>
+      </w:r>
+    </w:p>
+    <w:p>
+      <w:pPr>
+        <w:pStyle w:val="ListBullet"/>
+        <w:spacing w:after="80"/>
+      </w:pPr>
+      <w:r>
+        <w:rPr>
+          <w:b/>
+          <w:color w:val="4B6B94"/>
+        </w:rPr>
+        <w:t xml:space="preserve">Mobile Edge TFLite Conversion (export_tflite.py): </w:t>
+      </w:r>
+      <w:r>
+        <w:t>Quantizes Keras weight matrices to Float16, saving gesture_model.tflite, model_spec.json, and scaler parameters for Dart integration.</w:t>
+      </w:r>
+    </w:p>
+    <w:p>
+      <w:pPr>
+        <w:pStyle w:val="ListBullet"/>
+        <w:spacing w:after="80"/>
+      </w:pPr>
+      <w:r>
+        <w:rPr>
+          <w:b/>
+          <w:color w:val="4B6B94"/>
+        </w:rPr>
+        <w:t xml:space="preserve">Live Inference &amp; Client WebSockets (gesture_pipeline.py): </w:t>
+      </w:r>
+      <w:r>
+        <w:t>Executes camera frame inference, coordinates feature scaling, filters gestures via majority voting, dispatches system commands, and broadcasts state to Flutter.</w:t>
+      </w:r>
+    </w:p>
     <w:sectPr>
       <w:pgSz w:w="12240" w:h="15840"/>
       <w:pgMar w:top="1440" w:right="1440" w:bottom="1440" w:left="1440" w:header="720" w:footer="720" w:gutter="0"/>

</xml_diff>